<commit_message>
Clean up and add part 4
</commit_message>
<xml_diff>
--- a/lab_1/questions.docx
+++ b/lab_1/questions.docx
@@ -262,53 +262,21 @@
           <w:rStyle w:val="SubtleEmphasis"/>
           <w:lang w:val="fr-CA"/>
         </w:rPr>
-        <w:t xml:space="preserve">our lecture </w:t>
-      </w:r>
-      <w:proofErr w:type="gramStart"/>
-      <w:r>
-        <w:rPr>
-          <w:rStyle w:val="SubtleEmphasis"/>
-          <w:lang w:val="fr-CA"/>
-        </w:rPr>
-        <w:t>analogique</w:t>
-      </w:r>
-      <w:r>
-        <w:rPr>
-          <w:rStyle w:val="SubtleEmphasis"/>
-          <w:lang w:val="fr-CA"/>
-        </w:rPr>
-        <w:t>(</w:t>
-      </w:r>
-      <w:proofErr w:type="gramEnd"/>
-      <w:r>
-        <w:rPr>
-          <w:rStyle w:val="SubtleEmphasis"/>
-          <w:lang w:val="fr-CA"/>
-        </w:rPr>
-        <w:t>ADC)</w:t>
-      </w:r>
-      <w:r>
-        <w:rPr>
-          <w:rStyle w:val="SubtleEmphasis"/>
-          <w:lang w:val="fr-CA"/>
-        </w:rPr>
-        <w:t xml:space="preserve"> y a-t-il sur le </w:t>
-      </w:r>
-      <w:proofErr w:type="spellStart"/>
-      <w:r>
-        <w:rPr>
-          <w:rStyle w:val="SubtleEmphasis"/>
-          <w:lang w:val="fr-CA"/>
-        </w:rPr>
-        <w:t>Atmel</w:t>
-      </w:r>
-      <w:proofErr w:type="spellEnd"/>
-      <w:r>
-        <w:rPr>
-          <w:rStyle w:val="SubtleEmphasis"/>
-          <w:lang w:val="fr-CA"/>
-        </w:rPr>
-        <w:t xml:space="preserve"> Mega?</w:t>
+        <w:t>our lecture analogique</w:t>
+      </w:r>
+      <w:r>
+        <w:rPr>
+          <w:rStyle w:val="SubtleEmphasis"/>
+          <w:lang w:val="fr-CA"/>
+        </w:rPr>
+        <w:t>(ADC)</w:t>
+      </w:r>
+      <w:r>
+        <w:rPr>
+          <w:rStyle w:val="SubtleEmphasis"/>
+          <w:lang w:val="fr-CA"/>
+        </w:rPr>
+        <w:t xml:space="preserve"> y a-t-il sur le Atmel Mega?</w:t>
       </w:r>
     </w:p>
     <w:p>
@@ -528,23 +496,7 @@
           <w:rStyle w:val="SubtleEmphasis"/>
           <w:lang w:val="fr-CA"/>
         </w:rPr>
-        <w:t xml:space="preserve">Un Pulse </w:t>
-      </w:r>
-      <w:proofErr w:type="spellStart"/>
-      <w:r>
-        <w:rPr>
-          <w:rStyle w:val="SubtleEmphasis"/>
-          <w:lang w:val="fr-CA"/>
-        </w:rPr>
-        <w:t>Width</w:t>
-      </w:r>
-      <w:proofErr w:type="spellEnd"/>
-      <w:r>
-        <w:rPr>
-          <w:rStyle w:val="SubtleEmphasis"/>
-          <w:lang w:val="fr-CA"/>
-        </w:rPr>
-        <w:t xml:space="preserve"> Modulation (PWM) forme un</w:t>
+        <w:t>Un Pulse Width Modulation (PWM) forme un</w:t>
       </w:r>
       <w:r>
         <w:rPr>
@@ -773,23 +725,21 @@
           <w:rStyle w:val="SubtleEmphasis"/>
           <w:lang w:val="fr-CA"/>
         </w:rPr>
-        <w:t xml:space="preserve">Qu’elle est la largeur du signal de </w:t>
-      </w:r>
-      <w:proofErr w:type="spellStart"/>
-      <w:r>
-        <w:rPr>
-          <w:rStyle w:val="SubtleEmphasis"/>
-          <w:lang w:val="fr-CA"/>
-        </w:rPr>
-        <w:t>analogWrite</w:t>
-      </w:r>
-      <w:proofErr w:type="spellEnd"/>
-      <w:r>
-        <w:rPr>
-          <w:rStyle w:val="SubtleEmphasis"/>
-          <w:lang w:val="fr-CA"/>
-        </w:rPr>
-        <w:t>? (En ms ou Hz)</w:t>
+        <w:t>Qu’elle est la largeur</w:t>
+      </w:r>
+      <w:r>
+        <w:rPr>
+          <w:rStyle w:val="SubtleEmphasis"/>
+          <w:lang w:val="fr-CA"/>
+        </w:rPr>
+        <w:t>/fréquence</w:t>
+      </w:r>
+      <w:r>
+        <w:rPr>
+          <w:rStyle w:val="SubtleEmphasis"/>
+          <w:lang w:val="fr-CA"/>
+        </w:rPr>
+        <w:t xml:space="preserve"> du signal de analogWrite? (En ms ou Hz)</w:t>
       </w:r>
     </w:p>
     <w:p>
@@ -908,23 +858,7 @@
           <w:rStyle w:val="SubtleEmphasis"/>
           <w:lang w:val="fr-CA"/>
         </w:rPr>
-        <w:t xml:space="preserve">Quelle est le temps de réponse entre l’émetteur et le récepteur? Si on se base uniquement sur les </w:t>
-      </w:r>
-      <w:proofErr w:type="spellStart"/>
-      <w:r>
-        <w:rPr>
-          <w:rStyle w:val="SubtleEmphasis"/>
-          <w:lang w:val="fr-CA"/>
-        </w:rPr>
-        <w:t>DELs</w:t>
-      </w:r>
-      <w:proofErr w:type="spellEnd"/>
-      <w:r>
-        <w:rPr>
-          <w:rStyle w:val="SubtleEmphasis"/>
-          <w:lang w:val="fr-CA"/>
-        </w:rPr>
-        <w:t>.</w:t>
+        <w:t>Quelle est le temps de réponse entre l’émetteur et le récepteur? Si on se base uniquement sur les DELs.</w:t>
       </w:r>
     </w:p>
     <w:p>

</xml_diff>

<commit_message>
Type and delete part 4
</commit_message>
<xml_diff>
--- a/lab_1/questions.docx
+++ b/lab_1/questions.docx
@@ -276,23 +276,7 @@
           <w:rStyle w:val="SubtleEmphasis"/>
           <w:lang w:val="fr-CA"/>
         </w:rPr>
-        <w:t xml:space="preserve"> y a-t-il sur le </w:t>
-      </w:r>
-      <w:proofErr w:type="spellStart"/>
-      <w:r>
-        <w:rPr>
-          <w:rStyle w:val="SubtleEmphasis"/>
-          <w:lang w:val="fr-CA"/>
-        </w:rPr>
-        <w:t>Atmel</w:t>
-      </w:r>
-      <w:proofErr w:type="spellEnd"/>
-      <w:r>
-        <w:rPr>
-          <w:rStyle w:val="SubtleEmphasis"/>
-          <w:lang w:val="fr-CA"/>
-        </w:rPr>
-        <w:t xml:space="preserve"> Mega?</w:t>
+        <w:t xml:space="preserve"> y a-t-il sur le Atmel Mega?</w:t>
       </w:r>
     </w:p>
     <w:p>
@@ -512,23 +496,7 @@
           <w:rStyle w:val="SubtleEmphasis"/>
           <w:lang w:val="fr-CA"/>
         </w:rPr>
-        <w:t xml:space="preserve">Un Pulse </w:t>
-      </w:r>
-      <w:proofErr w:type="spellStart"/>
-      <w:r>
-        <w:rPr>
-          <w:rStyle w:val="SubtleEmphasis"/>
-          <w:lang w:val="fr-CA"/>
-        </w:rPr>
-        <w:t>Width</w:t>
-      </w:r>
-      <w:proofErr w:type="spellEnd"/>
-      <w:r>
-        <w:rPr>
-          <w:rStyle w:val="SubtleEmphasis"/>
-          <w:lang w:val="fr-CA"/>
-        </w:rPr>
-        <w:t xml:space="preserve"> Modulation (PWM) forme un</w:t>
+        <w:t>Un Pulse Width Modulation (PWM) forme un</w:t>
       </w:r>
       <w:r>
         <w:rPr>
@@ -771,23 +739,7 @@
           <w:rStyle w:val="SubtleEmphasis"/>
           <w:lang w:val="fr-CA"/>
         </w:rPr>
-        <w:t xml:space="preserve"> du signal de </w:t>
-      </w:r>
-      <w:proofErr w:type="spellStart"/>
-      <w:r>
-        <w:rPr>
-          <w:rStyle w:val="SubtleEmphasis"/>
-          <w:lang w:val="fr-CA"/>
-        </w:rPr>
-        <w:t>analogWrite</w:t>
-      </w:r>
-      <w:proofErr w:type="spellEnd"/>
-      <w:r>
-        <w:rPr>
-          <w:rStyle w:val="SubtleEmphasis"/>
-          <w:lang w:val="fr-CA"/>
-        </w:rPr>
-        <w:t>? (En ms ou Hz)</w:t>
+        <w:t xml:space="preserve"> du signal de analogWrite? (En ms ou Hz)</w:t>
       </w:r>
     </w:p>
     <w:p>
@@ -856,182 +808,6 @@
           <w:lang w:val="fr-CA"/>
         </w:rPr>
       </w:pPr>
-    </w:p>
-    <w:p>
-      <w:pPr>
-        <w:rPr>
-          <w:rStyle w:val="SubtleEmphasis"/>
-          <w:i w:val="0"/>
-          <w:iCs w:val="0"/>
-          <w:lang w:val="fr-CA"/>
-        </w:rPr>
-      </w:pPr>
-    </w:p>
-    <w:p>
-      <w:pPr>
-        <w:pStyle w:val="Subtitle"/>
-        <w:rPr>
-          <w:lang w:val="fr-CA"/>
-        </w:rPr>
-      </w:pPr>
-      <w:r>
-        <w:rPr>
-          <w:lang w:val="fr-CA"/>
-        </w:rPr>
-        <w:t xml:space="preserve">Partie </w:t>
-      </w:r>
-      <w:r>
-        <w:rPr>
-          <w:lang w:val="fr-CA"/>
-        </w:rPr>
-        <w:t>4</w:t>
-      </w:r>
-    </w:p>
-    <w:p>
-      <w:pPr>
-        <w:rPr>
-          <w:rStyle w:val="SubtleEmphasis"/>
-          <w:i w:val="0"/>
-          <w:iCs w:val="0"/>
-          <w:lang w:val="fr-CA"/>
-        </w:rPr>
-      </w:pPr>
-      <w:r>
-        <w:rPr>
-          <w:rStyle w:val="SubtleEmphasis"/>
-          <w:lang w:val="fr-CA"/>
-        </w:rPr>
-        <w:t xml:space="preserve">Question 1: </w:t>
-      </w:r>
-      <w:r>
-        <w:rPr>
-          <w:rStyle w:val="SubtleEmphasis"/>
-          <w:lang w:val="fr-CA"/>
-        </w:rPr>
-        <w:t xml:space="preserve">Quelle est le temps de réponse entre l’émetteur et le récepteur? Si on se base uniquement sur les </w:t>
-      </w:r>
-      <w:proofErr w:type="spellStart"/>
-      <w:r>
-        <w:rPr>
-          <w:rStyle w:val="SubtleEmphasis"/>
-          <w:lang w:val="fr-CA"/>
-        </w:rPr>
-        <w:t>DELs</w:t>
-      </w:r>
-      <w:proofErr w:type="spellEnd"/>
-      <w:r>
-        <w:rPr>
-          <w:rStyle w:val="SubtleEmphasis"/>
-          <w:lang w:val="fr-CA"/>
-        </w:rPr>
-        <w:t>.</w:t>
-      </w:r>
-      <w:r>
-        <w:rPr>
-          <w:rStyle w:val="SubtleEmphasis"/>
-          <w:lang w:val="fr-CA"/>
-        </w:rPr>
-        <w:t xml:space="preserve"> (Sans </w:t>
-      </w:r>
-      <w:proofErr w:type="spellStart"/>
-      <w:r>
-        <w:rPr>
-          <w:rStyle w:val="SubtleEmphasis"/>
-          <w:lang w:val="fr-CA"/>
-        </w:rPr>
-        <w:t>Serial.flush</w:t>
-      </w:r>
-      <w:proofErr w:type="spellEnd"/>
-      <w:r>
-        <w:rPr>
-          <w:rStyle w:val="SubtleEmphasis"/>
-          <w:lang w:val="fr-CA"/>
-        </w:rPr>
-        <w:t>()</w:t>
-      </w:r>
-      <w:r>
-        <w:rPr>
-          <w:rStyle w:val="SubtleEmphasis"/>
-          <w:lang w:val="fr-CA"/>
-        </w:rPr>
-        <w:t>)</w:t>
-      </w:r>
-    </w:p>
-    <w:p>
-      <w:pPr>
-        <w:rPr>
-          <w:rStyle w:val="SubtleEmphasis"/>
-          <w:i w:val="0"/>
-          <w:iCs w:val="0"/>
-          <w:lang w:val="fr-CA"/>
-        </w:rPr>
-      </w:pPr>
-      <w:r>
-        <w:rPr>
-          <w:rStyle w:val="SubtleEmphasis"/>
-          <w:i w:val="0"/>
-          <w:iCs w:val="0"/>
-          <w:lang w:val="fr-CA"/>
-        </w:rPr>
-        <w:t>.</w:t>
-      </w:r>
-    </w:p>
-    <w:p>
-      <w:pPr>
-        <w:rPr>
-          <w:rStyle w:val="SubtleEmphasis"/>
-          <w:i w:val="0"/>
-          <w:iCs w:val="0"/>
-          <w:lang w:val="fr-CA"/>
-        </w:rPr>
-      </w:pPr>
-      <w:r>
-        <w:rPr>
-          <w:rStyle w:val="SubtleEmphasis"/>
-          <w:i w:val="0"/>
-          <w:iCs w:val="0"/>
-          <w:lang w:val="fr-CA"/>
-        </w:rPr>
-        <w:t>.</w:t>
-      </w:r>
-    </w:p>
-    <w:p>
-      <w:pPr>
-        <w:rPr>
-          <w:rStyle w:val="SubtleEmphasis"/>
-          <w:i w:val="0"/>
-          <w:iCs w:val="0"/>
-          <w:lang w:val="fr-CA"/>
-        </w:rPr>
-      </w:pPr>
-      <w:r>
-        <w:rPr>
-          <w:rStyle w:val="SubtleEmphasis"/>
-          <w:i w:val="0"/>
-          <w:iCs w:val="0"/>
-          <w:lang w:val="fr-CA"/>
-        </w:rPr>
-        <w:t>.</w:t>
-      </w:r>
-    </w:p>
-    <w:p>
-      <w:pPr>
-        <w:rPr>
-          <w:rStyle w:val="SubtleEmphasis"/>
-          <w:i w:val="0"/>
-          <w:iCs w:val="0"/>
-          <w:lang w:val="fr-CA"/>
-        </w:rPr>
-      </w:pPr>
-      <w:r>
-        <w:rPr>
-          <w:rStyle w:val="SubtleEmphasis"/>
-          <w:i w:val="0"/>
-          <w:iCs w:val="0"/>
-          <w:lang w:val="fr-CA"/>
-        </w:rPr>
-        <w:t>.</w:t>
-      </w:r>
     </w:p>
     <w:p>
       <w:pPr>

</xml_diff>